<commit_message>
feat: copy template from Downloads, unify work hours text, improve 14px layout spacing
</commit_message>
<xml_diff>
--- a/frontend/dist/Шаблон.docx
+++ b/frontend/dist/Шаблон.docx
@@ -10,13 +10,23 @@
           <w:szCs w:val="28"/>
         </w:rPr>
       </w:pPr>
-      <w:r>
-        <w:rPr>
-          <w:rFonts w:ascii="Times New Roman" w:hAnsi="Times New Roman" w:cs="Times New Roman"/>
-          <w:sz w:val="28"/>
-          <w:szCs w:val="28"/>
-        </w:rPr>
-        <w:t>исх №____________</w:t>
+      <w:proofErr w:type="spellStart"/>
+      <w:r>
+        <w:rPr>
+          <w:rFonts w:ascii="Times New Roman" w:hAnsi="Times New Roman" w:cs="Times New Roman"/>
+          <w:sz w:val="28"/>
+          <w:szCs w:val="28"/>
+        </w:rPr>
+        <w:t>исх</w:t>
+      </w:r>
+      <w:proofErr w:type="spellEnd"/>
+      <w:r>
+        <w:rPr>
+          <w:rFonts w:ascii="Times New Roman" w:hAnsi="Times New Roman" w:cs="Times New Roman"/>
+          <w:sz w:val="28"/>
+          <w:szCs w:val="28"/>
+        </w:rPr>
+        <w:t xml:space="preserve"> №____________</w:t>
       </w:r>
     </w:p>
     <w:p>
@@ -69,8 +79,19 @@
           <w:szCs w:val="28"/>
           <w:lang w:val="kk-KZ"/>
         </w:rPr>
-        <w:t xml:space="preserve"> Правления</w:t>
-      </w:r>
+        <w:t xml:space="preserve"> </w:t>
+      </w:r>
+      <w:proofErr w:type="spellStart"/>
+      <w:r>
+        <w:rPr>
+          <w:rFonts w:ascii="Times New Roman" w:hAnsi="Times New Roman" w:cs="Times New Roman"/>
+          <w:sz w:val="28"/>
+          <w:szCs w:val="28"/>
+          <w:lang w:val="kk-KZ"/>
+        </w:rPr>
+        <w:t>Правления</w:t>
+      </w:r>
+      <w:proofErr w:type="spellEnd"/>
     </w:p>
     <w:p>
       <w:pPr>
@@ -88,8 +109,39 @@
           <w:szCs w:val="28"/>
           <w:lang w:val="kk-KZ"/>
         </w:rPr>
-        <w:t>АО «НПК» госпоже Ж.Т. Самаевой</w:t>
-      </w:r>
+        <w:t xml:space="preserve">АО «НПК» </w:t>
+      </w:r>
+      <w:proofErr w:type="spellStart"/>
+      <w:r>
+        <w:rPr>
+          <w:rFonts w:ascii="Times New Roman" w:hAnsi="Times New Roman" w:cs="Times New Roman"/>
+          <w:sz w:val="28"/>
+          <w:szCs w:val="28"/>
+          <w:lang w:val="kk-KZ"/>
+        </w:rPr>
+        <w:t>госпоже</w:t>
+      </w:r>
+      <w:proofErr w:type="spellEnd"/>
+      <w:r>
+        <w:rPr>
+          <w:rFonts w:ascii="Times New Roman" w:hAnsi="Times New Roman" w:cs="Times New Roman"/>
+          <w:sz w:val="28"/>
+          <w:szCs w:val="28"/>
+          <w:lang w:val="kk-KZ"/>
+        </w:rPr>
+        <w:t xml:space="preserve"> Ж.Т. </w:t>
+      </w:r>
+      <w:proofErr w:type="spellStart"/>
+      <w:r>
+        <w:rPr>
+          <w:rFonts w:ascii="Times New Roman" w:hAnsi="Times New Roman" w:cs="Times New Roman"/>
+          <w:sz w:val="28"/>
+          <w:szCs w:val="28"/>
+          <w:lang w:val="kk-KZ"/>
+        </w:rPr>
+        <w:t>Самаевой</w:t>
+      </w:r>
+      <w:proofErr w:type="spellEnd"/>
     </w:p>
     <w:p>
       <w:pPr>
@@ -227,8 +279,26 @@
           <w:sz w:val="28"/>
           <w:szCs w:val="28"/>
         </w:rPr>
-        <w:t xml:space="preserve"> Иванов Иван Иванович</w:t>
-      </w:r>
+        <w:t xml:space="preserve"> </w:t>
+      </w:r>
+      <w:r>
+        <w:rPr>
+          <w:rFonts w:ascii="Times New Roman" w:hAnsi="Times New Roman" w:cs="Times New Roman"/>
+          <w:sz w:val="28"/>
+          <w:szCs w:val="28"/>
+        </w:rPr>
+        <w:t xml:space="preserve">Азаматов Азамат </w:t>
+      </w:r>
+      <w:proofErr w:type="spellStart"/>
+      <w:r>
+        <w:rPr>
+          <w:rFonts w:ascii="Times New Roman" w:hAnsi="Times New Roman" w:cs="Times New Roman"/>
+          <w:sz w:val="28"/>
+          <w:szCs w:val="28"/>
+        </w:rPr>
+        <w:t>Азаматович</w:t>
+      </w:r>
+      <w:proofErr w:type="spellEnd"/>
       <w:r>
         <w:rPr>
           <w:rFonts w:ascii="Times New Roman" w:hAnsi="Times New Roman" w:cs="Times New Roman"/>
@@ -245,24 +315,9 @@
           <w:sz w:val="28"/>
           <w:szCs w:val="28"/>
         </w:rPr>
-        <w:t>ФИО (анг):</w:t>
-      </w:r>
-      <w:r>
-        <w:rPr>
-          <w:rFonts w:ascii="Times New Roman" w:hAnsi="Times New Roman" w:cs="Times New Roman"/>
-          <w:sz w:val="28"/>
-          <w:szCs w:val="28"/>
-        </w:rPr>
-        <w:t xml:space="preserve"> Ivanov Ivan</w:t>
-      </w:r>
-      <w:r>
-        <w:rPr>
-          <w:rFonts w:ascii="Times New Roman" w:hAnsi="Times New Roman" w:cs="Times New Roman"/>
-          <w:sz w:val="28"/>
-          <w:szCs w:val="28"/>
-        </w:rPr>
-        <w:br/>
-      </w:r>
+        <w:t>ФИО (</w:t>
+      </w:r>
+      <w:proofErr w:type="spellStart"/>
       <w:r>
         <w:rPr>
           <w:rFonts w:ascii="Times New Roman" w:hAnsi="Times New Roman" w:cs="Times New Roman"/>
@@ -271,24 +326,9 @@
           <w:sz w:val="28"/>
           <w:szCs w:val="28"/>
         </w:rPr>
-        <w:t>Должность:</w:t>
-      </w:r>
-      <w:r>
-        <w:rPr>
-          <w:rFonts w:ascii="Times New Roman" w:hAnsi="Times New Roman" w:cs="Times New Roman"/>
-          <w:sz w:val="28"/>
-          <w:szCs w:val="28"/>
-        </w:rPr>
-        <w:t xml:space="preserve"> Ведущий специалист</w:t>
-      </w:r>
-      <w:r>
-        <w:rPr>
-          <w:rFonts w:ascii="Times New Roman" w:hAnsi="Times New Roman" w:cs="Times New Roman"/>
-          <w:sz w:val="28"/>
-          <w:szCs w:val="28"/>
-        </w:rPr>
-        <w:br/>
-      </w:r>
+        <w:t>анг</w:t>
+      </w:r>
+      <w:proofErr w:type="spellEnd"/>
       <w:r>
         <w:rPr>
           <w:rFonts w:ascii="Times New Roman" w:hAnsi="Times New Roman" w:cs="Times New Roman"/>
@@ -297,15 +337,43 @@
           <w:sz w:val="28"/>
           <w:szCs w:val="28"/>
         </w:rPr>
-        <w:t>Организация:</w:t>
-      </w:r>
-      <w:r>
-        <w:rPr>
-          <w:rFonts w:ascii="Times New Roman" w:hAnsi="Times New Roman" w:cs="Times New Roman"/>
-          <w:sz w:val="28"/>
-          <w:szCs w:val="28"/>
-        </w:rPr>
-        <w:t xml:space="preserve"> ТОО «Пример»</w:t>
+        <w:t>):</w:t>
+      </w:r>
+      <w:r>
+        <w:rPr>
+          <w:rFonts w:ascii="Times New Roman" w:hAnsi="Times New Roman" w:cs="Times New Roman"/>
+          <w:sz w:val="28"/>
+          <w:szCs w:val="28"/>
+        </w:rPr>
+        <w:t xml:space="preserve"> </w:t>
+      </w:r>
+      <w:proofErr w:type="spellStart"/>
+      <w:r>
+        <w:rPr>
+          <w:rFonts w:ascii="Times New Roman" w:hAnsi="Times New Roman" w:cs="Times New Roman"/>
+          <w:sz w:val="28"/>
+          <w:szCs w:val="28"/>
+          <w:lang w:val="en-US"/>
+        </w:rPr>
+        <w:t>Azamatov</w:t>
+      </w:r>
+      <w:proofErr w:type="spellEnd"/>
+      <w:r>
+        <w:rPr>
+          <w:rFonts w:ascii="Times New Roman" w:hAnsi="Times New Roman" w:cs="Times New Roman"/>
+          <w:sz w:val="28"/>
+          <w:szCs w:val="28"/>
+        </w:rPr>
+        <w:t xml:space="preserve"> </w:t>
+      </w:r>
+      <w:r>
+        <w:rPr>
+          <w:rFonts w:ascii="Times New Roman" w:hAnsi="Times New Roman" w:cs="Times New Roman"/>
+          <w:sz w:val="28"/>
+          <w:szCs w:val="28"/>
+          <w:lang w:val="en-US"/>
+        </w:rPr>
+        <w:t>Azamat</w:t>
       </w:r>
       <w:r>
         <w:rPr>
@@ -323,15 +391,23 @@
           <w:sz w:val="28"/>
           <w:szCs w:val="28"/>
         </w:rPr>
-        <w:t>E-mail:</w:t>
-      </w:r>
-      <w:r>
-        <w:rPr>
-          <w:rFonts w:ascii="Times New Roman" w:hAnsi="Times New Roman" w:cs="Times New Roman"/>
-          <w:sz w:val="28"/>
-          <w:szCs w:val="28"/>
-        </w:rPr>
-        <w:t xml:space="preserve"> ivanov@example.kz</w:t>
+        <w:t>Должность:</w:t>
+      </w:r>
+      <w:r>
+        <w:rPr>
+          <w:rFonts w:ascii="Times New Roman" w:hAnsi="Times New Roman" w:cs="Times New Roman"/>
+          <w:sz w:val="28"/>
+          <w:szCs w:val="28"/>
+        </w:rPr>
+        <w:t xml:space="preserve"> </w:t>
+      </w:r>
+      <w:r>
+        <w:rPr>
+          <w:rFonts w:ascii="Times New Roman" w:hAnsi="Times New Roman" w:cs="Times New Roman"/>
+          <w:sz w:val="28"/>
+          <w:szCs w:val="28"/>
+        </w:rPr>
+        <w:t>Исполнительный специалист</w:t>
       </w:r>
       <w:r>
         <w:rPr>
@@ -349,15 +425,15 @@
           <w:sz w:val="28"/>
           <w:szCs w:val="28"/>
         </w:rPr>
-        <w:t>Моб. тел.:</w:t>
-      </w:r>
-      <w:r>
-        <w:rPr>
-          <w:rFonts w:ascii="Times New Roman" w:hAnsi="Times New Roman" w:cs="Times New Roman"/>
-          <w:sz w:val="28"/>
-          <w:szCs w:val="28"/>
-        </w:rPr>
-        <w:t xml:space="preserve"> +7 777 123 45 67</w:t>
+        <w:t>Организация:</w:t>
+      </w:r>
+      <w:r>
+        <w:rPr>
+          <w:rFonts w:ascii="Times New Roman" w:hAnsi="Times New Roman" w:cs="Times New Roman"/>
+          <w:sz w:val="28"/>
+          <w:szCs w:val="28"/>
+        </w:rPr>
+        <w:t xml:space="preserve"> ТОО «Пример»</w:t>
       </w:r>
       <w:r>
         <w:rPr>
@@ -375,15 +451,34 @@
           <w:sz w:val="28"/>
           <w:szCs w:val="28"/>
         </w:rPr>
-        <w:t>Раб. тел.:</w:t>
-      </w:r>
-      <w:r>
-        <w:rPr>
-          <w:rFonts w:ascii="Times New Roman" w:hAnsi="Times New Roman" w:cs="Times New Roman"/>
-          <w:sz w:val="28"/>
-          <w:szCs w:val="28"/>
-        </w:rPr>
-        <w:t xml:space="preserve"> +7 727 123 45 67</w:t>
+        <w:t>E-mail:</w:t>
+      </w:r>
+      <w:r>
+        <w:rPr>
+          <w:rFonts w:ascii="Times New Roman" w:hAnsi="Times New Roman" w:cs="Times New Roman"/>
+          <w:sz w:val="28"/>
+          <w:szCs w:val="28"/>
+        </w:rPr>
+        <w:t xml:space="preserve"> </w:t>
+      </w:r>
+      <w:proofErr w:type="spellStart"/>
+      <w:r>
+        <w:rPr>
+          <w:rFonts w:ascii="Times New Roman" w:hAnsi="Times New Roman" w:cs="Times New Roman"/>
+          <w:sz w:val="28"/>
+          <w:szCs w:val="28"/>
+          <w:lang w:val="en-US"/>
+        </w:rPr>
+        <w:t>Azamatov</w:t>
+      </w:r>
+      <w:proofErr w:type="spellEnd"/>
+      <w:r>
+        <w:rPr>
+          <w:rFonts w:ascii="Times New Roman" w:hAnsi="Times New Roman" w:cs="Times New Roman"/>
+          <w:sz w:val="28"/>
+          <w:szCs w:val="28"/>
+        </w:rPr>
+        <w:t>@example.kz</w:t>
       </w:r>
       <w:r>
         <w:rPr>
@@ -401,6 +496,58 @@
           <w:sz w:val="28"/>
           <w:szCs w:val="28"/>
         </w:rPr>
+        <w:t>Моб. тел.:</w:t>
+      </w:r>
+      <w:r>
+        <w:rPr>
+          <w:rFonts w:ascii="Times New Roman" w:hAnsi="Times New Roman" w:cs="Times New Roman"/>
+          <w:sz w:val="28"/>
+          <w:szCs w:val="28"/>
+        </w:rPr>
+        <w:t xml:space="preserve"> +7 777 123 45 67</w:t>
+      </w:r>
+      <w:r>
+        <w:rPr>
+          <w:rFonts w:ascii="Times New Roman" w:hAnsi="Times New Roman" w:cs="Times New Roman"/>
+          <w:sz w:val="28"/>
+          <w:szCs w:val="28"/>
+        </w:rPr>
+        <w:br/>
+      </w:r>
+      <w:r>
+        <w:rPr>
+          <w:rFonts w:ascii="Times New Roman" w:hAnsi="Times New Roman" w:cs="Times New Roman"/>
+          <w:b/>
+          <w:bCs/>
+          <w:sz w:val="28"/>
+          <w:szCs w:val="28"/>
+        </w:rPr>
+        <w:t>Раб. тел.:</w:t>
+      </w:r>
+      <w:r>
+        <w:rPr>
+          <w:rFonts w:ascii="Times New Roman" w:hAnsi="Times New Roman" w:cs="Times New Roman"/>
+          <w:sz w:val="28"/>
+          <w:szCs w:val="28"/>
+        </w:rPr>
+        <w:t xml:space="preserve"> +7 727 123 45 67</w:t>
+      </w:r>
+      <w:r>
+        <w:rPr>
+          <w:rFonts w:ascii="Times New Roman" w:hAnsi="Times New Roman" w:cs="Times New Roman"/>
+          <w:sz w:val="28"/>
+          <w:szCs w:val="28"/>
+        </w:rPr>
+        <w:br/>
+      </w:r>
+      <w:r>
+        <w:rPr>
+          <w:rFonts w:ascii="Times New Roman" w:hAnsi="Times New Roman" w:cs="Times New Roman"/>
+          <w:b/>
+          <w:bCs/>
+          <w:sz w:val="28"/>
+          <w:szCs w:val="28"/>
+        </w:rPr>
         <w:t>Сервисы:</w:t>
       </w:r>
       <w:r>
@@ -420,6 +567,7 @@
         </w:rPr>
         <w:t xml:space="preserve">: </w:t>
       </w:r>
+      <w:proofErr w:type="spellStart"/>
       <w:r>
         <w:rPr>
           <w:rFonts w:ascii="Times New Roman" w:hAnsi="Times New Roman" w:cs="Times New Roman"/>
@@ -437,14 +585,61 @@
         </w:rPr>
         <w:t>ий</w:t>
       </w:r>
-      <w:r>
-        <w:rPr>
-          <w:rFonts w:ascii="Times New Roman" w:hAnsi="Times New Roman" w:cs="Times New Roman"/>
-          <w:sz w:val="28"/>
-          <w:szCs w:val="28"/>
-        </w:rPr>
-        <w:t xml:space="preserve"> Центр, Fasti/VIDo, SWIFT, ЦОИД, СПБС, СОБС, Клиринг, МСПД, МСПК, СМЭП, СМП, Цифрово</w:t>
-      </w:r>
+      <w:proofErr w:type="spellEnd"/>
+      <w:r>
+        <w:rPr>
+          <w:rFonts w:ascii="Times New Roman" w:hAnsi="Times New Roman" w:cs="Times New Roman"/>
+          <w:sz w:val="28"/>
+          <w:szCs w:val="28"/>
+        </w:rPr>
+        <w:t xml:space="preserve"> Центр, </w:t>
+      </w:r>
+      <w:proofErr w:type="spellStart"/>
+      <w:r>
+        <w:rPr>
+          <w:rFonts w:ascii="Times New Roman" w:hAnsi="Times New Roman" w:cs="Times New Roman"/>
+          <w:sz w:val="28"/>
+          <w:szCs w:val="28"/>
+        </w:rPr>
+        <w:t>Fasti</w:t>
+      </w:r>
+      <w:proofErr w:type="spellEnd"/>
+      <w:r>
+        <w:rPr>
+          <w:rFonts w:ascii="Times New Roman" w:hAnsi="Times New Roman" w:cs="Times New Roman"/>
+          <w:sz w:val="28"/>
+          <w:szCs w:val="28"/>
+        </w:rPr>
+        <w:t>/</w:t>
+      </w:r>
+      <w:proofErr w:type="spellStart"/>
+      <w:r>
+        <w:rPr>
+          <w:rFonts w:ascii="Times New Roman" w:hAnsi="Times New Roman" w:cs="Times New Roman"/>
+          <w:sz w:val="28"/>
+          <w:szCs w:val="28"/>
+        </w:rPr>
+        <w:t>VIDo</w:t>
+      </w:r>
+      <w:proofErr w:type="spellEnd"/>
+      <w:r>
+        <w:rPr>
+          <w:rFonts w:ascii="Times New Roman" w:hAnsi="Times New Roman" w:cs="Times New Roman"/>
+          <w:sz w:val="28"/>
+          <w:szCs w:val="28"/>
+        </w:rPr>
+        <w:t xml:space="preserve">, SWIFT, ЦОИД, СПБС, СОБС, Клиринг, МСПД, МСПК, СМЭП, СМП, </w:t>
+      </w:r>
+      <w:proofErr w:type="spellStart"/>
+      <w:r>
+        <w:rPr>
+          <w:rFonts w:ascii="Times New Roman" w:hAnsi="Times New Roman" w:cs="Times New Roman"/>
+          <w:sz w:val="28"/>
+          <w:szCs w:val="28"/>
+        </w:rPr>
+        <w:t>Цифрово</w:t>
+      </w:r>
+      <w:proofErr w:type="spellEnd"/>
       <w:r>
         <w:rPr>
           <w:rFonts w:ascii="Times New Roman" w:hAnsi="Times New Roman" w:cs="Times New Roman"/>
@@ -460,7 +655,34 @@
           <w:sz w:val="28"/>
           <w:szCs w:val="28"/>
         </w:rPr>
-        <w:t xml:space="preserve"> тенге, Антифрод центр, Международн</w:t>
+        <w:t xml:space="preserve"> тенге, </w:t>
+      </w:r>
+      <w:proofErr w:type="spellStart"/>
+      <w:r>
+        <w:rPr>
+          <w:rFonts w:ascii="Times New Roman" w:hAnsi="Times New Roman" w:cs="Times New Roman"/>
+          <w:sz w:val="28"/>
+          <w:szCs w:val="28"/>
+        </w:rPr>
+        <w:t>Антифрод</w:t>
+      </w:r>
+      <w:proofErr w:type="spellEnd"/>
+      <w:r>
+        <w:rPr>
+          <w:rFonts w:ascii="Times New Roman" w:hAnsi="Times New Roman" w:cs="Times New Roman"/>
+          <w:sz w:val="28"/>
+          <w:szCs w:val="28"/>
+        </w:rPr>
+        <w:t xml:space="preserve"> центр, </w:t>
+      </w:r>
+      <w:proofErr w:type="spellStart"/>
+      <w:r>
+        <w:rPr>
+          <w:rFonts w:ascii="Times New Roman" w:hAnsi="Times New Roman" w:cs="Times New Roman"/>
+          <w:sz w:val="28"/>
+          <w:szCs w:val="28"/>
+        </w:rPr>
+        <w:t>Международн</w:t>
       </w:r>
       <w:r>
         <w:rPr>
@@ -471,6 +693,7 @@
         </w:rPr>
         <w:t>ый</w:t>
       </w:r>
+      <w:proofErr w:type="spellEnd"/>
       <w:r>
         <w:rPr>
           <w:rFonts w:ascii="Times New Roman" w:hAnsi="Times New Roman" w:cs="Times New Roman"/>
@@ -496,32 +719,84 @@
         </w:rPr>
         <w:t>[</w:t>
       </w:r>
-      <w:r>
-        <w:rPr>
-          <w:rFonts w:ascii="Times New Roman" w:hAnsi="Times New Roman" w:cs="Times New Roman"/>
-          <w:sz w:val="28"/>
-          <w:szCs w:val="28"/>
-          <w:lang w:val="kk-KZ"/>
-        </w:rPr>
-        <w:t>При необходимости д</w:t>
-      </w:r>
-      <w:r>
-        <w:rPr>
-          <w:rFonts w:ascii="Times New Roman" w:hAnsi="Times New Roman" w:cs="Times New Roman"/>
-          <w:sz w:val="28"/>
-          <w:szCs w:val="28"/>
-        </w:rPr>
-        <w:t>обавить по аналогии данные других сотрудников</w:t>
-      </w:r>
-      <w:r>
-        <w:rPr>
-          <w:rFonts w:ascii="Times New Roman" w:hAnsi="Times New Roman" w:cs="Times New Roman"/>
-          <w:sz w:val="28"/>
-          <w:szCs w:val="28"/>
-          <w:lang w:val="kk-KZ"/>
-        </w:rPr>
-        <w:t xml:space="preserve"> приложением</w:t>
-      </w:r>
+      <w:proofErr w:type="spellStart"/>
+      <w:r>
+        <w:rPr>
+          <w:rFonts w:ascii="Times New Roman" w:hAnsi="Times New Roman" w:cs="Times New Roman"/>
+          <w:sz w:val="28"/>
+          <w:szCs w:val="28"/>
+          <w:lang w:val="kk-KZ"/>
+        </w:rPr>
+        <w:t>При</w:t>
+      </w:r>
+      <w:proofErr w:type="spellEnd"/>
+      <w:r>
+        <w:rPr>
+          <w:rFonts w:ascii="Times New Roman" w:hAnsi="Times New Roman" w:cs="Times New Roman"/>
+          <w:sz w:val="28"/>
+          <w:szCs w:val="28"/>
+          <w:lang w:val="kk-KZ"/>
+        </w:rPr>
+        <w:t xml:space="preserve"> </w:t>
+      </w:r>
+      <w:proofErr w:type="spellStart"/>
+      <w:r>
+        <w:rPr>
+          <w:rFonts w:ascii="Times New Roman" w:hAnsi="Times New Roman" w:cs="Times New Roman"/>
+          <w:sz w:val="28"/>
+          <w:szCs w:val="28"/>
+          <w:lang w:val="kk-KZ"/>
+        </w:rPr>
+        <w:t>необходимости</w:t>
+      </w:r>
+      <w:proofErr w:type="spellEnd"/>
+      <w:r>
+        <w:rPr>
+          <w:rFonts w:ascii="Times New Roman" w:hAnsi="Times New Roman" w:cs="Times New Roman"/>
+          <w:sz w:val="28"/>
+          <w:szCs w:val="28"/>
+          <w:lang w:val="kk-KZ"/>
+        </w:rPr>
+        <w:t xml:space="preserve"> д</w:t>
+      </w:r>
+      <w:proofErr w:type="spellStart"/>
+      <w:r>
+        <w:rPr>
+          <w:rFonts w:ascii="Times New Roman" w:hAnsi="Times New Roman" w:cs="Times New Roman"/>
+          <w:sz w:val="28"/>
+          <w:szCs w:val="28"/>
+        </w:rPr>
+        <w:t>обавить</w:t>
+      </w:r>
+      <w:proofErr w:type="spellEnd"/>
+      <w:r>
+        <w:rPr>
+          <w:rFonts w:ascii="Times New Roman" w:hAnsi="Times New Roman" w:cs="Times New Roman"/>
+          <w:sz w:val="28"/>
+          <w:szCs w:val="28"/>
+        </w:rPr>
+        <w:t xml:space="preserve"> по аналогии данные других сотрудников</w:t>
+      </w:r>
+      <w:r>
+        <w:rPr>
+          <w:rFonts w:ascii="Times New Roman" w:hAnsi="Times New Roman" w:cs="Times New Roman"/>
+          <w:sz w:val="28"/>
+          <w:szCs w:val="28"/>
+          <w:lang w:val="kk-KZ"/>
+        </w:rPr>
+        <w:t xml:space="preserve"> </w:t>
+      </w:r>
+      <w:proofErr w:type="spellStart"/>
+      <w:r>
+        <w:rPr>
+          <w:rFonts w:ascii="Times New Roman" w:hAnsi="Times New Roman" w:cs="Times New Roman"/>
+          <w:sz w:val="28"/>
+          <w:szCs w:val="28"/>
+          <w:lang w:val="kk-KZ"/>
+        </w:rPr>
+        <w:t>приложением</w:t>
+      </w:r>
+      <w:proofErr w:type="spellEnd"/>
       <w:r>
         <w:rPr>
           <w:rFonts w:ascii="Times New Roman" w:hAnsi="Times New Roman" w:cs="Times New Roman"/>
@@ -1179,6 +1454,7 @@
   <w:style w:type="character" w:default="1" w:styleId="a0">
     <w:name w:val="Default Paragraph Font"/>
     <w:uiPriority w:val="1"/>
+    <w:semiHidden/>
     <w:unhideWhenUsed/>
   </w:style>
   <w:style w:type="table" w:default="1" w:styleId="a1">

</xml_diff>